<commit_message>
Describe DRONE EDUTRAIN as its own company, not a university subdivision
The company is an independent legal entity that happens to sit on the Turin
Polytechnic University campus, so the university no longer appears in any
heading of either document.

Diary: the approval block, the plan table section row and the location line on
all five weekly blocks now read «DRONE EDUTRAIN» MChJ with its education and
research direction. The campus location moves into the body, on the first day,
where it is stated as an independent legal entity whose workplace is on the
university grounds with cooperation on some research topics.

Order: the heading line naming the university is removed and the page recomposed
so the two remaining heading lines keep their original spacing. Everything else
is unchanged and still one page.

Co-Authored-By: Claude Opus 5 <noreply@anthropic.com>
Claude-Session: https://claude.ai/code/session_01FTg7CvKLGykoFQQqTsXm3e
</commit_message>
<xml_diff>
--- a/Kundalik_daftari_Jorayev_Akbar.docx
+++ b/Kundalik_daftari_Jorayev_Akbar.docx
@@ -335,7 +335,7 @@
                 <w:szCs w:val="22"/>
                 <w:lang w:val="en-US"/>
               </w:rPr>
-              <w:t xml:space="preserve">Toshkent shahridagi Turin politexnika universiteti</w:t>
+              <w:t xml:space="preserve">«DRONE EDUTRAIN» MChJ</w:t>
             </w:r>
           </w:p>
           <w:p>
@@ -366,7 +366,7 @@
                 <w:highlight w:val="yellow"/>
                 <w:lang w:val="en-US"/>
               </w:rPr>
-              <w:t xml:space="preserve">qoshidagi «DRONE EDUTRAIN» MChJ</w:t>
+              <w:t xml:space="preserve">direktori, amaliyot rahbari</w:t>
             </w:r>
           </w:p>
           <w:p>
@@ -386,29 +386,6 @@
                 <w:highlight w:val="yellow"/>
                 <w:lang w:val="en-US"/>
               </w:rPr>
-              <w:t xml:space="preserve">direktori, amaliyot rahbari</w:t>
-            </w:r>
-          </w:p>
-          <w:p>
-            <w:pPr>
-              <w:pStyle w:val="Normal"/>
-              <w:suppressLineNumbers w:val="0"/>
-              <w:bidi w:val="0"/>
-              <w:spacing w:before="0" w:beforeAutospacing="off" w:after="0" w:afterAutospacing="off" w:line="250" w:lineRule="auto"/>
-              <w:ind w:left="0" w:right="0"/>
-              <w:jc w:val="center"/>
-            </w:pPr>
-            <w:r>
-              <w:rPr>
-                <w:rFonts w:ascii="Calibri" w:hAnsi="Calibri" w:eastAsia="Calibri" w:cs="Calibri"/>
-                <w:b w:val="1"/>
-                <w:bCs w:val="1"/>
-                <w:i w:val="0"/>
-                <w:iCs w:val="0"/>
-                <w:sz w:val="22"/>
-                <w:szCs w:val="22"/>
-                <w:lang w:val="en-US"/>
-              </w:rPr>
               <w:t xml:space="preserve">M.M.Malikov</w:t>
             </w:r>
           </w:p>
@@ -428,7 +405,7 @@
                 <w:szCs w:val="22"/>
                 <w:lang w:val="en-US"/>
               </w:rPr>
-              <w:t>2026 yil «____» ____________</w:t>
+              <w:t xml:space="preserve">2026 yil «____» ____________</w:t>
             </w:r>
           </w:p>
         </w:tc>
@@ -792,7 +769,7 @@
                 <w:szCs w:val="21"/>
                 <w:lang w:val="en-US"/>
               </w:rPr>
-              <w:t xml:space="preserve">«DRONE EDUTRAIN» MChJ, Toshkent shahridagi Turin politexnika universiteti qoshidagi ta’lim va ilmiy tadqiqot yo‘nalishi</w:t>
+              <w:t xml:space="preserve">«DRONE EDUTRAIN» MChJ, ta’lim va ilmiy tadqiqot yo‘nalishi</w:t>
             </w:r>
           </w:p>
         </w:tc>
@@ -3154,7 +3131,7 @@
                 <w:szCs w:val="22"/>
                 <w:lang w:val="en-US"/>
               </w:rPr>
-              <w:t xml:space="preserve">Toshkent shahridagi Turin politexnika universiteti</w:t>
+              <w:t xml:space="preserve">«DRONE EDUTRAIN» MChJ,</w:t>
             </w:r>
           </w:p>
           <w:p>
@@ -3173,7 +3150,7 @@
                 <w:szCs w:val="22"/>
                 <w:lang w:val="en-US"/>
               </w:rPr>
-              <w:t xml:space="preserve">qoshidagi «DRONE EDUTRAIN» MChJ</w:t>
+              <w:t xml:space="preserve">ta’lim va ilmiy tadqiqot yo‘nalishi</w:t>
             </w:r>
           </w:p>
           <w:p>
@@ -3421,7 +3398,7 @@
                 <w:szCs w:val="22"/>
                 <w:lang w:val="en-US"/>
               </w:rPr>
-              <w:t xml:space="preserve">Korxonaning xavfsiz dron ta’limi ekotizimini shakllantirish yo‘nalishi, xodimlar o‘rtasidagi vazifalar taqsimoti va amaliyot davomida bajariladigan ishlar ro‘yxati o‘rganildi. Mehnat muhofazasi va xavfsizlik texnikasi bo‘yicha yo‘riqnoma o‘tildi.</w:t>
+              <w:t xml:space="preserve">Korxonaning xavfsiz dron ta’limi ekotizimini shakllantirish yo‘nalishi, xodimlar o‘rtasidagi vazifalar taqsimoti va amaliyot davomida bajariladigan ishlar ro‘yxati o‘rganildi. Korxona mustaqil yuridik shaxs bo‘lib, uning ish o‘rni Toshkent shahridagi Turin politexnika universiteti hududida joylashgani va universitet bilan ayrim ilmiy yo‘nalishlarda hamkorlik qilinishi qayd etildi. Mehnat muhofazasi va xavfsizlik texnikasi bo‘yicha yo‘riqnoma o‘tildi.</w:t>
             </w:r>
           </w:p>
           <w:p>
@@ -4229,7 +4206,7 @@
                 <w:szCs w:val="22"/>
                 <w:lang w:val="en-US"/>
               </w:rPr>
-              <w:t xml:space="preserve">Toshkent shahridagi Turin politexnika universiteti</w:t>
+              <w:t xml:space="preserve">«DRONE EDUTRAIN» MChJ,</w:t>
             </w:r>
           </w:p>
           <w:p>
@@ -4248,7 +4225,7 @@
                 <w:szCs w:val="22"/>
                 <w:lang w:val="en-US"/>
               </w:rPr>
-              <w:t xml:space="preserve">qoshidagi «DRONE EDUTRAIN» MChJ</w:t>
+              <w:t xml:space="preserve">ta’lim va ilmiy tadqiqot yo‘nalishi</w:t>
             </w:r>
           </w:p>
           <w:p>
@@ -5304,7 +5281,7 @@
                 <w:szCs w:val="22"/>
                 <w:lang w:val="en-US"/>
               </w:rPr>
-              <w:t xml:space="preserve">Toshkent shahridagi Turin politexnika universiteti</w:t>
+              <w:t xml:space="preserve">«DRONE EDUTRAIN» MChJ,</w:t>
             </w:r>
           </w:p>
           <w:p>
@@ -5323,7 +5300,7 @@
                 <w:szCs w:val="22"/>
                 <w:lang w:val="en-US"/>
               </w:rPr>
-              <w:t xml:space="preserve">qoshidagi «DRONE EDUTRAIN» MChJ</w:t>
+              <w:t xml:space="preserve">ta’lim va ilmiy tadqiqot yo‘nalishi</w:t>
             </w:r>
           </w:p>
           <w:p>
@@ -6379,7 +6356,7 @@
                 <w:szCs w:val="22"/>
                 <w:lang w:val="en-US"/>
               </w:rPr>
-              <w:t xml:space="preserve">Toshkent shahridagi Turin politexnika universiteti</w:t>
+              <w:t xml:space="preserve">«DRONE EDUTRAIN» MChJ,</w:t>
             </w:r>
           </w:p>
           <w:p>
@@ -6398,7 +6375,7 @@
                 <w:szCs w:val="22"/>
                 <w:lang w:val="en-US"/>
               </w:rPr>
-              <w:t xml:space="preserve">qoshidagi «DRONE EDUTRAIN» MChJ</w:t>
+              <w:t xml:space="preserve">ta’lim va ilmiy tadqiqot yo‘nalishi</w:t>
             </w:r>
           </w:p>
           <w:p>
@@ -7454,7 +7431,7 @@
                 <w:szCs w:val="22"/>
                 <w:lang w:val="en-US"/>
               </w:rPr>
-              <w:t xml:space="preserve">Toshkent shahridagi Turin politexnika universiteti</w:t>
+              <w:t xml:space="preserve">«DRONE EDUTRAIN» MChJ,</w:t>
             </w:r>
           </w:p>
           <w:p>
@@ -7473,7 +7450,7 @@
                 <w:szCs w:val="22"/>
                 <w:lang w:val="en-US"/>
               </w:rPr>
-              <w:t xml:space="preserve">qoshidagi «DRONE EDUTRAIN» MChJ</w:t>
+              <w:t xml:space="preserve">ta’lim va ilmiy tadqiqot yo‘nalishi</w:t>
             </w:r>
           </w:p>
           <w:p>

</xml_diff>

<commit_message>
Add the diary as PDF, and stop the weekly rows losing text at page breaks
Converting the diary revealed that each weekly block sat in a single table row
taller than a page. A row cannot break, so the overflow at the foot of the page
was dropped rather than carried over: 1583 characters vanished, most of them
from the right hand column of weeks 1, 3 and 4.

Each week is now split over two rows, three days and then the rest, so a page
break can fall between them. The fixed row heights are removed as well, letting
the rows size to their content. Verified by comparing the document text against
the rendered PDF character by character: nothing is lost now.

Co-Authored-By: Claude Opus 5 <noreply@anthropic.com>
Claude-Session: https://claude.ai/code/session_01FTg7CvKLGykoFQQqTsXm3e
</commit_message>
<xml_diff>
--- a/Kundalik_daftari_Jorayev_Akbar.docx
+++ b/Kundalik_daftari_Jorayev_Akbar.docx
@@ -3057,9 +3057,7 @@
         </w:tc>
       </w:tr>
       <w:tr>
-        <w:trPr>
-          <w:trHeight w:val="11700" w:hRule="atLeast"/>
-        </w:trPr>
+        <w:trPr/>
         <w:tc>
           <w:tcPr>
             <w:tcW w:w="760" w:type="dxa"/>
@@ -3264,6 +3262,32 @@
               <w:t xml:space="preserve">Shamol turbinasi kurakchalari bo‘yicha mavjud tasvirlar to‘plamini va oldingi model o‘qitish urinishini tahlil qilish.</w:t>
             </w:r>
           </w:p>
+        </w:tc>
+        <w:tc>
+          <w:tcPr>
+            <w:tcW w:w="4366" w:type="dxa"/>
+            <w:tcBorders>
+              <w:top w:val="single" w:color="000000" w:themeColor="accent6" w:sz="6"/>
+              <w:left w:val="single" w:color="000000" w:themeColor="accent6" w:sz="6"/>
+              <w:bottom w:val="single" w:color="000000" w:themeColor="accent6" w:sz="6"/>
+              <w:right w:val="single" w:color="000000" w:themeColor="accent6" w:sz="6"/>
+            </w:tcBorders>
+            <w:tcMar>
+              <w:top w:w="80" w:type="dxa"/>
+              <w:left w:w="100" w:type="dxa"/>
+              <w:bottom w:w="80" w:type="dxa"/>
+              <w:right w:w="100" w:type="dxa"/>
+            </w:tcMar>
+            <w:vAlign w:val="top"/>
+          </w:tcPr>
+          <w:p>
+            <w:pPr>
+              <w:spacing w:after="200"/>
+            </w:pPr>
+            <w:r>
+              <w:t xml:space="preserve"/>
+            </w:r>
+          </w:p>
           <w:p>
             <w:pPr>
               <w:spacing w:before="200" w:after="40" w:line="260"/>
@@ -3279,7 +3303,7 @@
                 <w:sz w:val="22"/>
                 <w:szCs w:val="22"/>
               </w:rPr>
-              <w:t xml:space="preserve">Sana: 11.06.2026</w:t>
+              <w:t xml:space="preserve">Sana: 08.06.2026</w:t>
             </w:r>
           </w:p>
           <w:p>
@@ -3298,7 +3322,7 @@
                 <w:szCs w:val="22"/>
                 <w:lang w:val="en-US"/>
               </w:rPr>
-              <w:t xml:space="preserve">Ma’lumotlar to‘plamini yettita tuzilmaviy mezon bo‘yicha tekshiruvchi audit vositasi bilan tanishish.</w:t>
+              <w:t xml:space="preserve">Korxonaning xavfsiz dron ta’limi ekotizimini shakllantirish yo‘nalishi, xodimlar o‘rtasidagi vazifalar taqsimoti va amaliyot davomida bajariladigan ishlar ro‘yxati o‘rganildi. Korxona mustaqil yuridik shaxs bo‘lib, uning ish o‘rni Toshkent shahridagi Turin politexnika universiteti hududida joylashgani va universitet bilan ayrim ilmiy yo‘nalishlarda hamkorlik qilinishi qayd etildi. Mehnat muhofazasi va xavfsizlik texnikasi bo‘yicha yo‘riqnoma o‘tildi.</w:t>
             </w:r>
           </w:p>
           <w:p>
@@ -3316,7 +3340,7 @@
                 <w:sz w:val="22"/>
                 <w:szCs w:val="22"/>
               </w:rPr>
-              <w:t xml:space="preserve">Sana: 12.06.2026</w:t>
+              <w:t xml:space="preserve">Sana: 09.06.2026</w:t>
             </w:r>
           </w:p>
           <w:p>
@@ -3335,33 +3359,7 @@
                 <w:szCs w:val="22"/>
                 <w:lang w:val="en-US"/>
               </w:rPr>
-              <w:t xml:space="preserve">Auditni mavjud to‘plamda ishga tushirish va natijalarni hujjatlashtirish.</w:t>
-            </w:r>
-          </w:p>
-        </w:tc>
-        <w:tc>
-          <w:tcPr>
-            <w:tcW w:w="4366" w:type="dxa"/>
-            <w:tcBorders>
-              <w:top w:val="single" w:color="000000" w:themeColor="accent6" w:sz="6"/>
-              <w:left w:val="single" w:color="000000" w:themeColor="accent6" w:sz="6"/>
-              <w:bottom w:val="single" w:color="000000" w:themeColor="accent6" w:sz="6"/>
-              <w:right w:val="single" w:color="000000" w:themeColor="accent6" w:sz="6"/>
-            </w:tcBorders>
-            <w:tcMar>
-              <w:top w:w="80" w:type="dxa"/>
-              <w:left w:w="100" w:type="dxa"/>
-              <w:bottom w:w="80" w:type="dxa"/>
-              <w:right w:w="100" w:type="dxa"/>
-            </w:tcMar>
-            <w:vAlign w:val="top"/>
-          </w:tcPr>
-          <w:p>
-            <w:pPr>
-              <w:spacing w:after="200"/>
-            </w:pPr>
-            <w:r>
-              <w:t xml:space="preserve"/>
+              <w:t xml:space="preserve">Paketning to‘rtta tarkibiy qismi, bitta paket 11 dona uskunadan iborat bo‘lib 10 nafar talaba va 1 nafar trener uchun mo‘ljallangani aniqlandi. Uskunaning og‘irligi 85 gramm, parvoz vaqti taxminan 6 daqiqa, kamerasiz va GPS siz ishlashi hamda 250 grammdan yengil dronlarga qo‘yiladigan talablarga mos kelishi ko‘rib chiqildi.</w:t>
             </w:r>
           </w:p>
           <w:p>
@@ -3379,7 +3377,7 @@
                 <w:sz w:val="22"/>
                 <w:szCs w:val="22"/>
               </w:rPr>
-              <w:t xml:space="preserve">Sana: 08.06.2026</w:t>
+              <w:t xml:space="preserve">Sana: 10.06.2026</w:t>
             </w:r>
           </w:p>
           <w:p>
@@ -3398,9 +3396,68 @@
                 <w:szCs w:val="22"/>
                 <w:lang w:val="en-US"/>
               </w:rPr>
-              <w:t xml:space="preserve">Korxonaning xavfsiz dron ta’limi ekotizimini shakllantirish yo‘nalishi, xodimlar o‘rtasidagi vazifalar taqsimoti va amaliyot davomida bajariladigan ishlar ro‘yxati o‘rganildi. Korxona mustaqil yuridik shaxs bo‘lib, uning ish o‘rni Toshkent shahridagi Turin politexnika universiteti hududida joylashgani va universitet bilan ayrim ilmiy yo‘nalishlarda hamkorlik qilinishi qayd etildi. Mehnat muhofazasi va xavfsizlik texnikasi bo‘yicha yo‘riqnoma o‘tildi.</w:t>
-            </w:r>
-          </w:p>
+              <w:t xml:space="preserve">To‘plamda 7520 ta tasvir borligi, sinflar taqsimoti keskin nomutanosib ekanligi va healthy sinfidagi belgilar segmentatsiya ko‘pburchagi, nuqson sinflari esa chegaralovchi ramka ko‘rinishida ekanligi aniqlandi. Oldingi o‘qitish seans vaqti tugagani sababli yetti davrda uzilib qolgani qayd etildi.</w:t>
+            </w:r>
+          </w:p>
+        </w:tc>
+      </w:tr>
+      <w:tr>
+        <w:trPr/>
+        <w:tc>
+          <w:tcPr>
+            <w:tcW w:w="760" w:type="dxa"/>
+            <w:tcBorders>
+              <w:top w:val="single" w:color="000000" w:themeColor="accent6" w:sz="6"/>
+              <w:left w:val="single" w:color="000000" w:themeColor="accent6" w:sz="6"/>
+              <w:bottom w:val="single" w:color="000000" w:themeColor="accent6" w:sz="6"/>
+              <w:right w:val="single" w:color="000000" w:themeColor="accent6" w:sz="6"/>
+            </w:tcBorders>
+            <w:tcMar>
+              <w:top w:w="80" w:type="dxa"/>
+              <w:left w:w="100" w:type="dxa"/>
+              <w:bottom w:w="80" w:type="dxa"/>
+              <w:right w:w="100" w:type="dxa"/>
+            </w:tcMar>
+            <w:textDirection w:val="btLr"/>
+            <w:vAlign w:val="center"/>
+          </w:tcPr>
+          <w:p>
+            <w:pPr>
+              <w:spacing w:before="0" w:after="60" w:line="260" w:lineRule="auto"/>
+              <w:jc w:val="center"/>
+            </w:pPr>
+            <w:r>
+              <w:rPr>
+                <w:rFonts w:ascii="Calibri" w:hAnsi="Calibri" w:eastAsia="Calibri" w:cs="Calibri"/>
+                <w:b w:val="1"/>
+                <w:bCs w:val="1"/>
+                <w:i w:val="1"/>
+                <w:iCs w:val="1"/>
+                <w:sz w:val="20"/>
+                <w:szCs w:val="20"/>
+                <w:lang w:val="en-US"/>
+              </w:rPr>
+              <w:t xml:space="preserve">«08».06.2026 yildan «12».06.2026 yilga qadar.</w:t>
+            </w:r>
+          </w:p>
+        </w:tc>
+        <w:tc>
+          <w:tcPr>
+            <w:tcW w:w="3900" w:type="dxa"/>
+            <w:tcBorders>
+              <w:top w:val="single" w:color="000000" w:themeColor="accent6" w:sz="6"/>
+              <w:left w:val="single" w:color="000000" w:themeColor="accent6" w:sz="6"/>
+              <w:bottom w:val="single" w:color="000000" w:themeColor="accent6" w:sz="6"/>
+              <w:right w:val="single" w:color="000000" w:themeColor="accent6" w:sz="6"/>
+            </w:tcBorders>
+            <w:tcMar>
+              <w:top w:w="80" w:type="dxa"/>
+              <w:left w:w="100" w:type="dxa"/>
+              <w:bottom w:w="80" w:type="dxa"/>
+              <w:right w:w="100" w:type="dxa"/>
+            </w:tcMar>
+            <w:vAlign w:val="top"/>
+          </w:tcPr>
           <w:p>
             <w:pPr>
               <w:spacing w:before="200" w:after="40" w:line="260"/>
@@ -3416,7 +3473,7 @@
                 <w:sz w:val="22"/>
                 <w:szCs w:val="22"/>
               </w:rPr>
-              <w:t xml:space="preserve">Sana: 09.06.2026</w:t>
+              <w:t xml:space="preserve">Sana: 11.06.2026</w:t>
             </w:r>
           </w:p>
           <w:p>
@@ -3435,7 +3492,7 @@
                 <w:szCs w:val="22"/>
                 <w:lang w:val="en-US"/>
               </w:rPr>
-              <w:t xml:space="preserve">Paketning to‘rtta tarkibiy qismi, bitta paket 11 dona uskunadan iborat bo‘lib 10 nafar talaba va 1 nafar trener uchun mo‘ljallangani aniqlandi. Uskunaning og‘irligi 85 gramm, parvoz vaqti taxminan 6 daqiqa, kamerasiz va GPS siz ishlashi hamda 250 grammdan yengil dronlarga qo‘yiladigan talablarga mos kelishi ko‘rib chiqildi.</w:t>
+              <w:t xml:space="preserve">Ma’lumotlar to‘plamini yettita tuzilmaviy mezon bo‘yicha tekshiruvchi audit vositasi bilan tanishish.</w:t>
             </w:r>
           </w:p>
           <w:p>
@@ -3453,7 +3510,7 @@
                 <w:sz w:val="22"/>
                 <w:szCs w:val="22"/>
               </w:rPr>
-              <w:t xml:space="preserve">Sana: 10.06.2026</w:t>
+              <w:t xml:space="preserve">Sana: 12.06.2026</w:t>
             </w:r>
           </w:p>
           <w:p>
@@ -3472,7 +3529,33 @@
                 <w:szCs w:val="22"/>
                 <w:lang w:val="en-US"/>
               </w:rPr>
-              <w:t xml:space="preserve">To‘plamda 7520 ta tasvir borligi, sinflar taqsimoti keskin nomutanosib ekanligi va healthy sinfidagi belgilar segmentatsiya ko‘pburchagi, nuqson sinflari esa chegaralovchi ramka ko‘rinishida ekanligi aniqlandi. Oldingi o‘qitish seans vaqti tugagani sababli yetti davrda uzilib qolgani qayd etildi.</w:t>
+              <w:t xml:space="preserve">Auditni mavjud to‘plamda ishga tushirish va natijalarni hujjatlashtirish.</w:t>
+            </w:r>
+          </w:p>
+        </w:tc>
+        <w:tc>
+          <w:tcPr>
+            <w:tcW w:w="4366" w:type="dxa"/>
+            <w:tcBorders>
+              <w:top w:val="single" w:color="000000" w:themeColor="accent6" w:sz="6"/>
+              <w:left w:val="single" w:color="000000" w:themeColor="accent6" w:sz="6"/>
+              <w:bottom w:val="single" w:color="000000" w:themeColor="accent6" w:sz="6"/>
+              <w:right w:val="single" w:color="000000" w:themeColor="accent6" w:sz="6"/>
+            </w:tcBorders>
+            <w:tcMar>
+              <w:top w:w="80" w:type="dxa"/>
+              <w:left w:w="100" w:type="dxa"/>
+              <w:bottom w:w="80" w:type="dxa"/>
+              <w:right w:w="100" w:type="dxa"/>
+            </w:tcMar>
+            <w:vAlign w:val="top"/>
+          </w:tcPr>
+          <w:p>
+            <w:pPr>
+              <w:spacing w:after="200"/>
+            </w:pPr>
+            <w:r>
+              <w:t xml:space="preserve"/>
             </w:r>
           </w:p>
           <w:p>
@@ -3655,9 +3738,7 @@
         </w:tc>
       </w:tr>
       <w:tr>
-        <w:trPr>
-          <w:trHeight w:val="11700" w:hRule="atLeast"/>
-        </w:trPr>
+        <w:trPr/>
         <w:tc>
           <w:tcPr>
             <w:tcW w:w="4513" w:type="dxa"/>
@@ -4132,9 +4213,7 @@
         </w:tc>
       </w:tr>
       <w:tr>
-        <w:trPr>
-          <w:trHeight w:val="11700" w:hRule="atLeast"/>
-        </w:trPr>
+        <w:trPr/>
         <w:tc>
           <w:tcPr>
             <w:tcW w:w="760" w:type="dxa"/>
@@ -4339,6 +4418,32 @@
               <w:t xml:space="preserve">Tasvir sifati auditini o‘tkazish va takroriy kadrlarni yo‘qotish.</w:t>
             </w:r>
           </w:p>
+        </w:tc>
+        <w:tc>
+          <w:tcPr>
+            <w:tcW w:w="4366" w:type="dxa"/>
+            <w:tcBorders>
+              <w:top w:val="single" w:color="000000" w:themeColor="accent6" w:sz="6"/>
+              <w:left w:val="single" w:color="000000" w:themeColor="accent6" w:sz="6"/>
+              <w:bottom w:val="single" w:color="000000" w:themeColor="accent6" w:sz="6"/>
+              <w:right w:val="single" w:color="000000" w:themeColor="accent6" w:sz="6"/>
+            </w:tcBorders>
+            <w:tcMar>
+              <w:top w:w="80" w:type="dxa"/>
+              <w:left w:w="100" w:type="dxa"/>
+              <w:bottom w:w="80" w:type="dxa"/>
+              <w:right w:w="100" w:type="dxa"/>
+            </w:tcMar>
+            <w:vAlign w:val="top"/>
+          </w:tcPr>
+          <w:p>
+            <w:pPr>
+              <w:spacing w:after="200"/>
+            </w:pPr>
+            <w:r>
+              <w:t xml:space="preserve"/>
+            </w:r>
+          </w:p>
           <w:p>
             <w:pPr>
               <w:spacing w:before="200" w:after="40" w:line="260"/>
@@ -4354,7 +4459,7 @@
                 <w:sz w:val="22"/>
                 <w:szCs w:val="22"/>
               </w:rPr>
-              <w:t xml:space="preserve">Sana: 18.06.2026</w:t>
+              <w:t xml:space="preserve">Sana: 15.06.2026</w:t>
             </w:r>
           </w:p>
           <w:p>
@@ -4373,7 +4478,7 @@
                 <w:szCs w:val="22"/>
                 <w:lang w:val="en-US"/>
               </w:rPr>
-              <w:t xml:space="preserve">Auditni qayta ishga tushirish va o‘qitish konfiguratsiyasini alohida skriptga chiqarish.</w:t>
+              <w:t xml:space="preserve">Bir manba tasvirdan olingan sun’iy nusxalar faqat bitta bo‘linmaga tushishi ta’minlandi, aks holda tekshirish to‘plami o‘qitish to‘plamining takroriga aylanishi aniqlandi. Segmentatsiya ko‘pburchaklari yagona chegaralovchi ramka formatiga keltirildi.</w:t>
             </w:r>
           </w:p>
           <w:p>
@@ -4391,7 +4496,7 @@
                 <w:sz w:val="22"/>
                 <w:szCs w:val="22"/>
               </w:rPr>
-              <w:t xml:space="preserve">Sana: 19.06.2026</w:t>
+              <w:t xml:space="preserve">Sana: 16.06.2026</w:t>
             </w:r>
           </w:p>
           <w:p>
@@ -4410,33 +4515,7 @@
                 <w:szCs w:val="22"/>
                 <w:lang w:val="en-US"/>
               </w:rPr>
-              <w:t xml:space="preserve">Modelni 960 piksel o‘lchamda qayta o‘qitish va jarayonni nazorat qilish.</w:t>
-            </w:r>
-          </w:p>
-        </w:tc>
-        <w:tc>
-          <w:tcPr>
-            <w:tcW w:w="4366" w:type="dxa"/>
-            <w:tcBorders>
-              <w:top w:val="single" w:color="000000" w:themeColor="accent6" w:sz="6"/>
-              <w:left w:val="single" w:color="000000" w:themeColor="accent6" w:sz="6"/>
-              <w:bottom w:val="single" w:color="000000" w:themeColor="accent6" w:sz="6"/>
-              <w:right w:val="single" w:color="000000" w:themeColor="accent6" w:sz="6"/>
-            </w:tcBorders>
-            <w:tcMar>
-              <w:top w:w="80" w:type="dxa"/>
-              <w:left w:w="100" w:type="dxa"/>
-              <w:bottom w:w="80" w:type="dxa"/>
-              <w:right w:w="100" w:type="dxa"/>
-            </w:tcMar>
-            <w:vAlign w:val="top"/>
-          </w:tcPr>
-          <w:p>
-            <w:pPr>
-              <w:spacing w:after="200"/>
-            </w:pPr>
-            <w:r>
-              <w:t xml:space="preserve"/>
+              <w:t xml:space="preserve">To‘plam avval oraliq katalogda tayyorlanib, so‘ngra almashtiriladigan qilindi, shunda uzilish yuz berganda eski to‘plam yo‘qolmaydi. Har bir bo‘linmaga alohida tasodifiy sonlar manbasi berildi, shunda o‘qitish qismidagi o‘zgarish tekshirish va sinov qismlarini siljitmaydi. Yorliqsiz tasvirlar nuqson emas, manfiy namuna sifatida hisoblandi.</w:t>
             </w:r>
           </w:p>
           <w:p>
@@ -4454,7 +4533,7 @@
                 <w:sz w:val="22"/>
                 <w:szCs w:val="22"/>
               </w:rPr>
-              <w:t xml:space="preserve">Sana: 15.06.2026</w:t>
+              <w:t xml:space="preserve">Sana: 17.06.2026</w:t>
             </w:r>
           </w:p>
           <w:p>
@@ -4473,9 +4552,68 @@
                 <w:szCs w:val="22"/>
                 <w:lang w:val="en-US"/>
               </w:rPr>
-              <w:t xml:space="preserve">Bir manba tasvirdan olingan sun’iy nusxalar faqat bitta bo‘linmaga tushishi ta’minlandi, aks holda tekshirish to‘plami o‘qitish to‘plamining takroriga aylanishi aniqlandi. Segmentatsiya ko‘pburchaklari yagona chegaralovchi ramka formatiga keltirildi.</w:t>
-            </w:r>
-          </w:p>
+              <w:t xml:space="preserve">Ravshanlik Laplas dispersiyasi orqali baholandi va belgilangan chegaradan past kadrlar chiqarib tashlandi. Farq xeshi yordamida bir biriga juda o‘xshash kadrlar aniqlanib, ular orasidan bittasi qoldirildi. Turli manzaralar soni alohida sanaldi.</w:t>
+            </w:r>
+          </w:p>
+        </w:tc>
+      </w:tr>
+      <w:tr>
+        <w:trPr/>
+        <w:tc>
+          <w:tcPr>
+            <w:tcW w:w="760" w:type="dxa"/>
+            <w:tcBorders>
+              <w:top w:val="single" w:color="000000" w:themeColor="accent6" w:sz="6"/>
+              <w:left w:val="single" w:color="000000" w:themeColor="accent6" w:sz="6"/>
+              <w:bottom w:val="single" w:color="000000" w:themeColor="accent6" w:sz="6"/>
+              <w:right w:val="single" w:color="000000" w:themeColor="accent6" w:sz="6"/>
+            </w:tcBorders>
+            <w:tcMar>
+              <w:top w:w="80" w:type="dxa"/>
+              <w:left w:w="100" w:type="dxa"/>
+              <w:bottom w:w="80" w:type="dxa"/>
+              <w:right w:w="100" w:type="dxa"/>
+            </w:tcMar>
+            <w:textDirection w:val="btLr"/>
+            <w:vAlign w:val="center"/>
+          </w:tcPr>
+          <w:p>
+            <w:pPr>
+              <w:spacing w:before="0" w:after="60" w:line="260" w:lineRule="auto"/>
+              <w:jc w:val="center"/>
+            </w:pPr>
+            <w:r>
+              <w:rPr>
+                <w:rFonts w:ascii="Calibri" w:hAnsi="Calibri" w:eastAsia="Calibri" w:cs="Calibri"/>
+                <w:b w:val="1"/>
+                <w:bCs w:val="1"/>
+                <w:i w:val="1"/>
+                <w:iCs w:val="1"/>
+                <w:sz w:val="20"/>
+                <w:szCs w:val="20"/>
+                <w:lang w:val="en-US"/>
+              </w:rPr>
+              <w:t xml:space="preserve">«15».06.2026 yildan «19».06.2026 yilga qadar.</w:t>
+            </w:r>
+          </w:p>
+        </w:tc>
+        <w:tc>
+          <w:tcPr>
+            <w:tcW w:w="3900" w:type="dxa"/>
+            <w:tcBorders>
+              <w:top w:val="single" w:color="000000" w:themeColor="accent6" w:sz="6"/>
+              <w:left w:val="single" w:color="000000" w:themeColor="accent6" w:sz="6"/>
+              <w:bottom w:val="single" w:color="000000" w:themeColor="accent6" w:sz="6"/>
+              <w:right w:val="single" w:color="000000" w:themeColor="accent6" w:sz="6"/>
+            </w:tcBorders>
+            <w:tcMar>
+              <w:top w:w="80" w:type="dxa"/>
+              <w:left w:w="100" w:type="dxa"/>
+              <w:bottom w:w="80" w:type="dxa"/>
+              <w:right w:w="100" w:type="dxa"/>
+            </w:tcMar>
+            <w:vAlign w:val="top"/>
+          </w:tcPr>
           <w:p>
             <w:pPr>
               <w:spacing w:before="200" w:after="40" w:line="260"/>
@@ -4491,7 +4629,7 @@
                 <w:sz w:val="22"/>
                 <w:szCs w:val="22"/>
               </w:rPr>
-              <w:t xml:space="preserve">Sana: 16.06.2026</w:t>
+              <w:t xml:space="preserve">Sana: 18.06.2026</w:t>
             </w:r>
           </w:p>
           <w:p>
@@ -4510,7 +4648,7 @@
                 <w:szCs w:val="22"/>
                 <w:lang w:val="en-US"/>
               </w:rPr>
-              <w:t xml:space="preserve">To‘plam avval oraliq katalogda tayyorlanib, so‘ngra almashtiriladigan qilindi, shunda uzilish yuz berganda eski to‘plam yo‘qolmaydi. Har bir bo‘linmaga alohida tasodifiy sonlar manbasi berildi, shunda o‘qitish qismidagi o‘zgarish tekshirish va sinov qismlarini siljitmaydi. Yorliqsiz tasvirlar nuqson emas, manfiy namuna sifatida hisoblandi.</w:t>
+              <w:t xml:space="preserve">Auditni qayta ishga tushirish va o‘qitish konfiguratsiyasini alohida skriptga chiqarish.</w:t>
             </w:r>
           </w:p>
           <w:p>
@@ -4528,7 +4666,7 @@
                 <w:sz w:val="22"/>
                 <w:szCs w:val="22"/>
               </w:rPr>
-              <w:t xml:space="preserve">Sana: 17.06.2026</w:t>
+              <w:t xml:space="preserve">Sana: 19.06.2026</w:t>
             </w:r>
           </w:p>
           <w:p>
@@ -4547,7 +4685,33 @@
                 <w:szCs w:val="22"/>
                 <w:lang w:val="en-US"/>
               </w:rPr>
-              <w:t xml:space="preserve">Ravshanlik Laplas dispersiyasi orqali baholandi va belgilangan chegaradan past kadrlar chiqarib tashlandi. Farq xeshi yordamida bir biriga juda o‘xshash kadrlar aniqlanib, ular orasidan bittasi qoldirildi. Turli manzaralar soni alohida sanaldi.</w:t>
+              <w:t xml:space="preserve">Modelni 960 piksel o‘lchamda qayta o‘qitish va jarayonni nazorat qilish.</w:t>
+            </w:r>
+          </w:p>
+        </w:tc>
+        <w:tc>
+          <w:tcPr>
+            <w:tcW w:w="4366" w:type="dxa"/>
+            <w:tcBorders>
+              <w:top w:val="single" w:color="000000" w:themeColor="accent6" w:sz="6"/>
+              <w:left w:val="single" w:color="000000" w:themeColor="accent6" w:sz="6"/>
+              <w:bottom w:val="single" w:color="000000" w:themeColor="accent6" w:sz="6"/>
+              <w:right w:val="single" w:color="000000" w:themeColor="accent6" w:sz="6"/>
+            </w:tcBorders>
+            <w:tcMar>
+              <w:top w:w="80" w:type="dxa"/>
+              <w:left w:w="100" w:type="dxa"/>
+              <w:bottom w:w="80" w:type="dxa"/>
+              <w:right w:w="100" w:type="dxa"/>
+            </w:tcMar>
+            <w:vAlign w:val="top"/>
+          </w:tcPr>
+          <w:p>
+            <w:pPr>
+              <w:spacing w:after="200"/>
+            </w:pPr>
+            <w:r>
+              <w:t xml:space="preserve"/>
             </w:r>
           </w:p>
           <w:p>
@@ -4730,9 +4894,7 @@
         </w:tc>
       </w:tr>
       <w:tr>
-        <w:trPr>
-          <w:trHeight w:val="11700" w:hRule="atLeast"/>
-        </w:trPr>
+        <w:trPr/>
         <w:tc>
           <w:tcPr>
             <w:tcW w:w="4513" w:type="dxa"/>
@@ -5207,9 +5369,7 @@
         </w:tc>
       </w:tr>
       <w:tr>
-        <w:trPr>
-          <w:trHeight w:val="11700" w:hRule="atLeast"/>
-        </w:trPr>
+        <w:trPr/>
         <w:tc>
           <w:tcPr>
             <w:tcW w:w="760" w:type="dxa"/>
@@ -5414,6 +5574,32 @@
               <w:t xml:space="preserve">Model sinovida aniqlangan jiddiy kamchilikni tahlil qilish.</w:t>
             </w:r>
           </w:p>
+        </w:tc>
+        <w:tc>
+          <w:tcPr>
+            <w:tcW w:w="4366" w:type="dxa"/>
+            <w:tcBorders>
+              <w:top w:val="single" w:color="000000" w:themeColor="accent6" w:sz="6"/>
+              <w:left w:val="single" w:color="000000" w:themeColor="accent6" w:sz="6"/>
+              <w:bottom w:val="single" w:color="000000" w:themeColor="accent6" w:sz="6"/>
+              <w:right w:val="single" w:color="000000" w:themeColor="accent6" w:sz="6"/>
+            </w:tcBorders>
+            <w:tcMar>
+              <w:top w:w="80" w:type="dxa"/>
+              <w:left w:w="100" w:type="dxa"/>
+              <w:bottom w:w="80" w:type="dxa"/>
+              <w:right w:w="100" w:type="dxa"/>
+            </w:tcMar>
+            <w:vAlign w:val="top"/>
+          </w:tcPr>
+          <w:p>
+            <w:pPr>
+              <w:spacing w:after="200"/>
+            </w:pPr>
+            <w:r>
+              <w:t xml:space="preserve"/>
+            </w:r>
+          </w:p>
           <w:p>
             <w:pPr>
               <w:spacing w:before="200" w:after="40" w:line="260"/>
@@ -5429,7 +5615,7 @@
                 <w:sz w:val="22"/>
                 <w:szCs w:val="22"/>
               </w:rPr>
-              <w:t xml:space="preserve">Sana: 25.06.2026</w:t>
+              <w:t xml:space="preserve">Sana: 22.06.2026</w:t>
             </w:r>
           </w:p>
           <w:p>
@@ -5448,7 +5634,7 @@
                 <w:szCs w:val="22"/>
                 <w:lang w:val="en-US"/>
               </w:rPr>
-              <w:t xml:space="preserve">Modelni metrikalari bilan arxivga o‘tkazish va yangi to‘plamga qo‘yiladigan talablarni yozish.</w:t>
+              <w:t xml:space="preserve">Sinov to‘plamida umumiy ko‘rsatkichlar olindi: mAP@0.5 qiymati 0.759, mAP@0.5:0.95 qiymati 0.478, aniqlik 0.708 va to‘liqlik 0.792. Sinflar bo‘yicha natija sezilarli farq qildi: crack uchun mAP@0.5 qiymati 0.938, surface peeling uchun 0.781, corrosion uchun esa atigi 0.557.</w:t>
             </w:r>
           </w:p>
           <w:p>
@@ -5466,7 +5652,7 @@
                 <w:sz w:val="22"/>
                 <w:szCs w:val="22"/>
               </w:rPr>
-              <w:t xml:space="preserve">Sana: 26.06.2026</w:t>
+              <w:t xml:space="preserve">Sana: 23.06.2026</w:t>
             </w:r>
           </w:p>
           <w:p>
@@ -5485,33 +5671,7 @@
                 <w:szCs w:val="22"/>
                 <w:lang w:val="en-US"/>
               </w:rPr>
-              <w:t xml:space="preserve">Modelni ONNX formatiga eksport qilish, int8 kvantlash va dekoder muvofiqligini tekshirish.</w:t>
-            </w:r>
-          </w:p>
-        </w:tc>
-        <w:tc>
-          <w:tcPr>
-            <w:tcW w:w="4366" w:type="dxa"/>
-            <w:tcBorders>
-              <w:top w:val="single" w:color="000000" w:themeColor="accent6" w:sz="6"/>
-              <w:left w:val="single" w:color="000000" w:themeColor="accent6" w:sz="6"/>
-              <w:bottom w:val="single" w:color="000000" w:themeColor="accent6" w:sz="6"/>
-              <w:right w:val="single" w:color="000000" w:themeColor="accent6" w:sz="6"/>
-            </w:tcBorders>
-            <w:tcMar>
-              <w:top w:w="80" w:type="dxa"/>
-              <w:left w:w="100" w:type="dxa"/>
-              <w:bottom w:w="80" w:type="dxa"/>
-              <w:right w:w="100" w:type="dxa"/>
-            </w:tcMar>
-            <w:vAlign w:val="top"/>
-          </w:tcPr>
-          <w:p>
-            <w:pPr>
-              <w:spacing w:after="200"/>
-            </w:pPr>
-            <w:r>
-              <w:t xml:space="preserve"/>
+              <w:t xml:space="preserve">Model 400 ta soz kurakcha tasviriga qo‘llanildi va chizilgan ramkalar ko‘zdan kechirildi. Soxta ijobiy natija ulushi 0.5 foizni tashkil etdi.</w:t>
             </w:r>
           </w:p>
           <w:p>
@@ -5529,7 +5689,7 @@
                 <w:sz w:val="22"/>
                 <w:szCs w:val="22"/>
               </w:rPr>
-              <w:t xml:space="preserve">Sana: 22.06.2026</w:t>
+              <w:t xml:space="preserve">Sana: 24.06.2026</w:t>
             </w:r>
           </w:p>
           <w:p>
@@ -5548,9 +5708,68 @@
                 <w:szCs w:val="22"/>
                 <w:lang w:val="en-US"/>
               </w:rPr>
-              <w:t xml:space="preserve">Sinov to‘plamida umumiy ko‘rsatkichlar olindi: mAP@0.5 qiymati 0.759, mAP@0.5:0.95 qiymati 0.478, aniqlik 0.708 va to‘liqlik 0.792. Sinflar bo‘yicha natija sezilarli farq qildi: crack uchun mAP@0.5 qiymati 0.938, surface peeling uchun 0.781, corrosion uchun esa atigi 0.557.</w:t>
-            </w:r>
-          </w:p>
+              <w:t xml:space="preserve">Yaxshi ko‘rsatkichlarga qaramay model kurakchasi butunlay uzilgan turbina fotosuratida hech qanday nuqson topmadi. Uchta sabab aniqlandi: sinflar ro‘yxatida konstruksiyaviy buzilish umuman yo‘q edi, barcha nuqson namunalari yaqindan olingan tasvirlar edi, manfiy namunalar esa uzoqdan olingan kadrlardan iborat bo‘lgani uchun model keng qamrovli suratni nuqsonsizlik belgisi sifatida o‘rgangan edi.</w:t>
+            </w:r>
+          </w:p>
+        </w:tc>
+      </w:tr>
+      <w:tr>
+        <w:trPr/>
+        <w:tc>
+          <w:tcPr>
+            <w:tcW w:w="760" w:type="dxa"/>
+            <w:tcBorders>
+              <w:top w:val="single" w:color="000000" w:themeColor="accent6" w:sz="6"/>
+              <w:left w:val="single" w:color="000000" w:themeColor="accent6" w:sz="6"/>
+              <w:bottom w:val="single" w:color="000000" w:themeColor="accent6" w:sz="6"/>
+              <w:right w:val="single" w:color="000000" w:themeColor="accent6" w:sz="6"/>
+            </w:tcBorders>
+            <w:tcMar>
+              <w:top w:w="80" w:type="dxa"/>
+              <w:left w:w="100" w:type="dxa"/>
+              <w:bottom w:w="80" w:type="dxa"/>
+              <w:right w:w="100" w:type="dxa"/>
+            </w:tcMar>
+            <w:textDirection w:val="btLr"/>
+            <w:vAlign w:val="center"/>
+          </w:tcPr>
+          <w:p>
+            <w:pPr>
+              <w:spacing w:before="0" w:after="60" w:line="260" w:lineRule="auto"/>
+              <w:jc w:val="center"/>
+            </w:pPr>
+            <w:r>
+              <w:rPr>
+                <w:rFonts w:ascii="Calibri" w:hAnsi="Calibri" w:eastAsia="Calibri" w:cs="Calibri"/>
+                <w:b w:val="1"/>
+                <w:bCs w:val="1"/>
+                <w:i w:val="1"/>
+                <w:iCs w:val="1"/>
+                <w:sz w:val="20"/>
+                <w:szCs w:val="20"/>
+                <w:lang w:val="en-US"/>
+              </w:rPr>
+              <w:t xml:space="preserve">«22».06.2026 yildan «26».06.2026 yilga qadar.</w:t>
+            </w:r>
+          </w:p>
+        </w:tc>
+        <w:tc>
+          <w:tcPr>
+            <w:tcW w:w="3900" w:type="dxa"/>
+            <w:tcBorders>
+              <w:top w:val="single" w:color="000000" w:themeColor="accent6" w:sz="6"/>
+              <w:left w:val="single" w:color="000000" w:themeColor="accent6" w:sz="6"/>
+              <w:bottom w:val="single" w:color="000000" w:themeColor="accent6" w:sz="6"/>
+              <w:right w:val="single" w:color="000000" w:themeColor="accent6" w:sz="6"/>
+            </w:tcBorders>
+            <w:tcMar>
+              <w:top w:w="80" w:type="dxa"/>
+              <w:left w:w="100" w:type="dxa"/>
+              <w:bottom w:w="80" w:type="dxa"/>
+              <w:right w:w="100" w:type="dxa"/>
+            </w:tcMar>
+            <w:vAlign w:val="top"/>
+          </w:tcPr>
           <w:p>
             <w:pPr>
               <w:spacing w:before="200" w:after="40" w:line="260"/>
@@ -5566,7 +5785,7 @@
                 <w:sz w:val="22"/>
                 <w:szCs w:val="22"/>
               </w:rPr>
-              <w:t xml:space="preserve">Sana: 23.06.2026</w:t>
+              <w:t xml:space="preserve">Sana: 25.06.2026</w:t>
             </w:r>
           </w:p>
           <w:p>
@@ -5585,7 +5804,7 @@
                 <w:szCs w:val="22"/>
                 <w:lang w:val="en-US"/>
               </w:rPr>
-              <w:t xml:space="preserve">Model 400 ta soz kurakcha tasviriga qo‘llanildi va chizilgan ramkalar ko‘zdan kechirildi. Soxta ijobiy natija ulushi 0.5 foizni tashkil etdi.</w:t>
+              <w:t xml:space="preserve">Modelni metrikalari bilan arxivga o‘tkazish va yangi to‘plamga qo‘yiladigan talablarni yozish.</w:t>
             </w:r>
           </w:p>
           <w:p>
@@ -5603,7 +5822,7 @@
                 <w:sz w:val="22"/>
                 <w:szCs w:val="22"/>
               </w:rPr>
-              <w:t xml:space="preserve">Sana: 24.06.2026</w:t>
+              <w:t xml:space="preserve">Sana: 26.06.2026</w:t>
             </w:r>
           </w:p>
           <w:p>
@@ -5622,7 +5841,33 @@
                 <w:szCs w:val="22"/>
                 <w:lang w:val="en-US"/>
               </w:rPr>
-              <w:t xml:space="preserve">Yaxshi ko‘rsatkichlarga qaramay model kurakchasi butunlay uzilgan turbina fotosuratida hech qanday nuqson topmadi. Uchta sabab aniqlandi: sinflar ro‘yxatida konstruksiyaviy buzilish umuman yo‘q edi, barcha nuqson namunalari yaqindan olingan tasvirlar edi, manfiy namunalar esa uzoqdan olingan kadrlardan iborat bo‘lgani uchun model keng qamrovli suratni nuqsonsizlik belgisi sifatida o‘rgangan edi.</w:t>
+              <w:t xml:space="preserve">Modelni ONNX formatiga eksport qilish, int8 kvantlash va dekoder muvofiqligini tekshirish.</w:t>
+            </w:r>
+          </w:p>
+        </w:tc>
+        <w:tc>
+          <w:tcPr>
+            <w:tcW w:w="4366" w:type="dxa"/>
+            <w:tcBorders>
+              <w:top w:val="single" w:color="000000" w:themeColor="accent6" w:sz="6"/>
+              <w:left w:val="single" w:color="000000" w:themeColor="accent6" w:sz="6"/>
+              <w:bottom w:val="single" w:color="000000" w:themeColor="accent6" w:sz="6"/>
+              <w:right w:val="single" w:color="000000" w:themeColor="accent6" w:sz="6"/>
+            </w:tcBorders>
+            <w:tcMar>
+              <w:top w:w="80" w:type="dxa"/>
+              <w:left w:w="100" w:type="dxa"/>
+              <w:bottom w:w="80" w:type="dxa"/>
+              <w:right w:w="100" w:type="dxa"/>
+            </w:tcMar>
+            <w:vAlign w:val="top"/>
+          </w:tcPr>
+          <w:p>
+            <w:pPr>
+              <w:spacing w:after="200"/>
+            </w:pPr>
+            <w:r>
+              <w:t xml:space="preserve"/>
             </w:r>
           </w:p>
           <w:p>
@@ -5805,9 +6050,7 @@
         </w:tc>
       </w:tr>
       <w:tr>
-        <w:trPr>
-          <w:trHeight w:val="11700" w:hRule="atLeast"/>
-        </w:trPr>
+        <w:trPr/>
         <w:tc>
           <w:tcPr>
             <w:tcW w:w="4513" w:type="dxa"/>
@@ -6282,9 +6525,7 @@
         </w:tc>
       </w:tr>
       <w:tr>
-        <w:trPr>
-          <w:trHeight w:val="11700" w:hRule="atLeast"/>
-        </w:trPr>
+        <w:trPr/>
         <w:tc>
           <w:tcPr>
             <w:tcW w:w="760" w:type="dxa"/>
@@ -6489,6 +6730,32 @@
               <w:t xml:space="preserve">Video fayllardan tahlilga yaroqli kadrlarni tanlash modulini ishlab chiqish.</w:t>
             </w:r>
           </w:p>
+        </w:tc>
+        <w:tc>
+          <w:tcPr>
+            <w:tcW w:w="4366" w:type="dxa"/>
+            <w:tcBorders>
+              <w:top w:val="single" w:color="000000" w:themeColor="accent6" w:sz="6"/>
+              <w:left w:val="single" w:color="000000" w:themeColor="accent6" w:sz="6"/>
+              <w:bottom w:val="single" w:color="000000" w:themeColor="accent6" w:sz="6"/>
+              <w:right w:val="single" w:color="000000" w:themeColor="accent6" w:sz="6"/>
+            </w:tcBorders>
+            <w:tcMar>
+              <w:top w:w="80" w:type="dxa"/>
+              <w:left w:w="100" w:type="dxa"/>
+              <w:bottom w:w="80" w:type="dxa"/>
+              <w:right w:w="100" w:type="dxa"/>
+            </w:tcMar>
+            <w:vAlign w:val="top"/>
+          </w:tcPr>
+          <w:p>
+            <w:pPr>
+              <w:spacing w:after="200"/>
+            </w:pPr>
+            <w:r>
+              <w:t xml:space="preserve"/>
+            </w:r>
+          </w:p>
           <w:p>
             <w:pPr>
               <w:spacing w:before="200" w:after="40" w:line="260"/>
@@ -6504,7 +6771,7 @@
                 <w:sz w:val="22"/>
                 <w:szCs w:val="22"/>
               </w:rPr>
-              <w:t xml:space="preserve">Sana: 02.07.2026</w:t>
+              <w:t xml:space="preserve">Sana: 29.06.2026</w:t>
             </w:r>
           </w:p>
           <w:p>
@@ -6523,7 +6790,7 @@
                 <w:szCs w:val="22"/>
                 <w:lang w:val="en-US"/>
               </w:rPr>
-              <w:t xml:space="preserve">Jonli kuzatuv moduli: obyektlarni kadrlar orasida bog‘lash va sanash.</w:t>
+              <w:t xml:space="preserve">Ilova alohida yig‘ish bosqichisiz, statik fayllar ko‘rinishida ishlaydigan qilindi. Modellar ro‘yxati alohida manifest faylida saqlanadi, shunda yangi modelni joylashtirish uchun dastur kodini o‘zgartirish talab etilmaydi. Yuklanmagan model xatolik bilan to‘xtamay, mavjud emas deb ko‘rsatiladigan qilindi.</w:t>
             </w:r>
           </w:p>
           <w:p>
@@ -6541,7 +6808,7 @@
                 <w:sz w:val="22"/>
                 <w:szCs w:val="22"/>
               </w:rPr>
-              <w:t xml:space="preserve">Sana: 03.07.2026</w:t>
+              <w:t xml:space="preserve">Sana: 30.06.2026</w:t>
             </w:r>
           </w:p>
           <w:p>
@@ -6560,33 +6827,7 @@
                 <w:szCs w:val="22"/>
                 <w:lang w:val="en-US"/>
               </w:rPr>
-              <w:t xml:space="preserve">Modelsiz alanga va tutun aniqlash modulini o‘rganish.</w:t>
-            </w:r>
-          </w:p>
-        </w:tc>
-        <w:tc>
-          <w:tcPr>
-            <w:tcW w:w="4366" w:type="dxa"/>
-            <w:tcBorders>
-              <w:top w:val="single" w:color="000000" w:themeColor="accent6" w:sz="6"/>
-              <w:left w:val="single" w:color="000000" w:themeColor="accent6" w:sz="6"/>
-              <w:bottom w:val="single" w:color="000000" w:themeColor="accent6" w:sz="6"/>
-              <w:right w:val="single" w:color="000000" w:themeColor="accent6" w:sz="6"/>
-            </w:tcBorders>
-            <w:tcMar>
-              <w:top w:w="80" w:type="dxa"/>
-              <w:left w:w="100" w:type="dxa"/>
-              <w:bottom w:w="80" w:type="dxa"/>
-              <w:right w:w="100" w:type="dxa"/>
-            </w:tcMar>
-            <w:vAlign w:val="top"/>
-          </w:tcPr>
-          <w:p>
-            <w:pPr>
-              <w:spacing w:after="200"/>
-            </w:pPr>
-            <w:r>
-              <w:t xml:space="preserve"/>
+              <w:t xml:space="preserve">Klassifikator tasvirni turbina, quyosh paneli, olomon yoki yong‘in yo‘nalishlaridan biriga ajratadi va mos kelmaydigan tasvirni rad etadi. Aniqlangan nuqsonlar asosida jiddiylik balli hisoblanadi va natijalar sana, tasvirlar soni hamda model versiyalari ko‘rsatilgan bosma hisobotga chiqariladi.</w:t>
             </w:r>
           </w:p>
           <w:p>
@@ -6604,7 +6845,7 @@
                 <w:sz w:val="22"/>
                 <w:szCs w:val="22"/>
               </w:rPr>
-              <w:t xml:space="preserve">Sana: 29.06.2026</w:t>
+              <w:t xml:space="preserve">Sana: 01.07.2026</w:t>
             </w:r>
           </w:p>
           <w:p>
@@ -6623,9 +6864,68 @@
                 <w:szCs w:val="22"/>
                 <w:lang w:val="en-US"/>
               </w:rPr>
-              <w:t xml:space="preserve">Ilova alohida yig‘ish bosqichisiz, statik fayllar ko‘rinishida ishlaydigan qilindi. Modellar ro‘yxati alohida manifest faylida saqlanadi, shunda yangi modelni joylashtirish uchun dastur kodini o‘zgartirish talab etilmaydi. Yuklanmagan model xatolik bilan to‘xtamay, mavjud emas deb ko‘rsatiladigan qilindi.</w:t>
-            </w:r>
-          </w:p>
+              <w:t xml:space="preserve">Video kadrlarga ajratiladi, har bir kadr ravshanlik bo‘yicha baholanadi, takroriy kadrlar farq xeshi orqali chiqarib tashlanadi va bir necha ming kadrdan bir necha o‘nlab turlicha aniq kadr qoldiriladi. Modulning cheklovi hujjatlashtirildi: tanlov qamrov bo‘yicha amalga oshiriladi, shuning uchun faqat bitta xira kadrda ko‘ringan nuqson tushib qolishi mumkin.</w:t>
+            </w:r>
+          </w:p>
+        </w:tc>
+      </w:tr>
+      <w:tr>
+        <w:trPr/>
+        <w:tc>
+          <w:tcPr>
+            <w:tcW w:w="760" w:type="dxa"/>
+            <w:tcBorders>
+              <w:top w:val="single" w:color="000000" w:themeColor="accent6" w:sz="6"/>
+              <w:left w:val="single" w:color="000000" w:themeColor="accent6" w:sz="6"/>
+              <w:bottom w:val="single" w:color="000000" w:themeColor="accent6" w:sz="6"/>
+              <w:right w:val="single" w:color="000000" w:themeColor="accent6" w:sz="6"/>
+            </w:tcBorders>
+            <w:tcMar>
+              <w:top w:w="80" w:type="dxa"/>
+              <w:left w:w="100" w:type="dxa"/>
+              <w:bottom w:w="80" w:type="dxa"/>
+              <w:right w:w="100" w:type="dxa"/>
+            </w:tcMar>
+            <w:textDirection w:val="btLr"/>
+            <w:vAlign w:val="center"/>
+          </w:tcPr>
+          <w:p>
+            <w:pPr>
+              <w:spacing w:before="0" w:after="60" w:line="260" w:lineRule="auto"/>
+              <w:jc w:val="center"/>
+            </w:pPr>
+            <w:r>
+              <w:rPr>
+                <w:rFonts w:ascii="Calibri" w:hAnsi="Calibri" w:eastAsia="Calibri" w:cs="Calibri"/>
+                <w:b w:val="1"/>
+                <w:bCs w:val="1"/>
+                <w:i w:val="1"/>
+                <w:iCs w:val="1"/>
+                <w:sz w:val="20"/>
+                <w:szCs w:val="20"/>
+                <w:lang w:val="en-US"/>
+              </w:rPr>
+              <w:t xml:space="preserve">«29».06.2026 yildan «03».07.2026 yilga qadar.</w:t>
+            </w:r>
+          </w:p>
+        </w:tc>
+        <w:tc>
+          <w:tcPr>
+            <w:tcW w:w="3900" w:type="dxa"/>
+            <w:tcBorders>
+              <w:top w:val="single" w:color="000000" w:themeColor="accent6" w:sz="6"/>
+              <w:left w:val="single" w:color="000000" w:themeColor="accent6" w:sz="6"/>
+              <w:bottom w:val="single" w:color="000000" w:themeColor="accent6" w:sz="6"/>
+              <w:right w:val="single" w:color="000000" w:themeColor="accent6" w:sz="6"/>
+            </w:tcBorders>
+            <w:tcMar>
+              <w:top w:w="80" w:type="dxa"/>
+              <w:left w:w="100" w:type="dxa"/>
+              <w:bottom w:w="80" w:type="dxa"/>
+              <w:right w:w="100" w:type="dxa"/>
+            </w:tcMar>
+            <w:vAlign w:val="top"/>
+          </w:tcPr>
           <w:p>
             <w:pPr>
               <w:spacing w:before="200" w:after="40" w:line="260"/>
@@ -6641,7 +6941,7 @@
                 <w:sz w:val="22"/>
                 <w:szCs w:val="22"/>
               </w:rPr>
-              <w:t xml:space="preserve">Sana: 30.06.2026</w:t>
+              <w:t xml:space="preserve">Sana: 02.07.2026</w:t>
             </w:r>
           </w:p>
           <w:p>
@@ -6660,7 +6960,7 @@
                 <w:szCs w:val="22"/>
                 <w:lang w:val="en-US"/>
               </w:rPr>
-              <w:t xml:space="preserve">Klassifikator tasvirni turbina, quyosh paneli, olomon yoki yong‘in yo‘nalishlaridan biriga ajratadi va mos kelmaydigan tasvirni rad etadi. Aniqlangan nuqsonlar asosida jiddiylik balli hisoblanadi va natijalar sana, tasvirlar soni hamda model versiyalari ko‘rsatilgan bosma hisobotga chiqariladi.</w:t>
+              <w:t xml:space="preserve">Jonli kuzatuv moduli: obyektlarni kadrlar orasida bog‘lash va sanash.</w:t>
             </w:r>
           </w:p>
           <w:p>
@@ -6678,7 +6978,7 @@
                 <w:sz w:val="22"/>
                 <w:szCs w:val="22"/>
               </w:rPr>
-              <w:t xml:space="preserve">Sana: 01.07.2026</w:t>
+              <w:t xml:space="preserve">Sana: 03.07.2026</w:t>
             </w:r>
           </w:p>
           <w:p>
@@ -6697,7 +6997,33 @@
                 <w:szCs w:val="22"/>
                 <w:lang w:val="en-US"/>
               </w:rPr>
-              <w:t xml:space="preserve">Video kadrlarga ajratiladi, har bir kadr ravshanlik bo‘yicha baholanadi, takroriy kadrlar farq xeshi orqali chiqarib tashlanadi va bir necha ming kadrdan bir necha o‘nlab turlicha aniq kadr qoldiriladi. Modulning cheklovi hujjatlashtirildi: tanlov qamrov bo‘yicha amalga oshiriladi, shuning uchun faqat bitta xira kadrda ko‘ringan nuqson tushib qolishi mumkin.</w:t>
+              <w:t xml:space="preserve">Modelsiz alanga va tutun aniqlash modulini o‘rganish.</w:t>
+            </w:r>
+          </w:p>
+        </w:tc>
+        <w:tc>
+          <w:tcPr>
+            <w:tcW w:w="4366" w:type="dxa"/>
+            <w:tcBorders>
+              <w:top w:val="single" w:color="000000" w:themeColor="accent6" w:sz="6"/>
+              <w:left w:val="single" w:color="000000" w:themeColor="accent6" w:sz="6"/>
+              <w:bottom w:val="single" w:color="000000" w:themeColor="accent6" w:sz="6"/>
+              <w:right w:val="single" w:color="000000" w:themeColor="accent6" w:sz="6"/>
+            </w:tcBorders>
+            <w:tcMar>
+              <w:top w:w="80" w:type="dxa"/>
+              <w:left w:w="100" w:type="dxa"/>
+              <w:bottom w:w="80" w:type="dxa"/>
+              <w:right w:w="100" w:type="dxa"/>
+            </w:tcMar>
+            <w:vAlign w:val="top"/>
+          </w:tcPr>
+          <w:p>
+            <w:pPr>
+              <w:spacing w:after="200"/>
+            </w:pPr>
+            <w:r>
+              <w:t xml:space="preserve"/>
             </w:r>
           </w:p>
           <w:p>
@@ -6880,9 +7206,7 @@
         </w:tc>
       </w:tr>
       <w:tr>
-        <w:trPr>
-          <w:trHeight w:val="11700" w:hRule="atLeast"/>
-        </w:trPr>
+        <w:trPr/>
         <w:tc>
           <w:tcPr>
             <w:tcW w:w="4513" w:type="dxa"/>
@@ -7357,9 +7681,7 @@
         </w:tc>
       </w:tr>
       <w:tr>
-        <w:trPr>
-          <w:trHeight w:val="11700" w:hRule="atLeast"/>
-        </w:trPr>
+        <w:trPr/>
         <w:tc>
           <w:tcPr>
             <w:tcW w:w="760" w:type="dxa"/>
@@ -7527,6 +7849,32 @@
               <w:t xml:space="preserve">Xavfsizlik cheklovlarini o‘rganish hamda natijalarni o‘quv materiallariga aylantirish bo‘yicha muhokamalarda ishtirok etish.</w:t>
             </w:r>
           </w:p>
+        </w:tc>
+        <w:tc>
+          <w:tcPr>
+            <w:tcW w:w="4366" w:type="dxa"/>
+            <w:tcBorders>
+              <w:top w:val="single" w:color="000000" w:themeColor="accent6" w:sz="6"/>
+              <w:left w:val="single" w:color="000000" w:themeColor="accent6" w:sz="6"/>
+              <w:bottom w:val="single" w:color="000000" w:themeColor="accent6" w:sz="6"/>
+              <w:right w:val="single" w:color="000000" w:themeColor="accent6" w:sz="6"/>
+            </w:tcBorders>
+            <w:tcMar>
+              <w:top w:w="80" w:type="dxa"/>
+              <w:left w:w="100" w:type="dxa"/>
+              <w:bottom w:w="80" w:type="dxa"/>
+              <w:right w:w="100" w:type="dxa"/>
+            </w:tcMar>
+            <w:vAlign w:val="top"/>
+          </w:tcPr>
+          <w:p>
+            <w:pPr>
+              <w:spacing w:after="200"/>
+            </w:pPr>
+            <w:r>
+              <w:t xml:space="preserve"/>
+            </w:r>
+          </w:p>
           <w:p>
             <w:pPr>
               <w:spacing w:before="200" w:after="40" w:line="260"/>
@@ -7542,7 +7890,7 @@
                 <w:sz w:val="22"/>
                 <w:szCs w:val="22"/>
               </w:rPr>
-              <w:t xml:space="preserve">Sana: 08.07.2026</w:t>
+              <w:t xml:space="preserve">Sana: 06.07.2026</w:t>
             </w:r>
           </w:p>
           <w:p>
@@ -7561,33 +7909,7 @@
                 <w:szCs w:val="22"/>
                 <w:lang w:val="en-US"/>
               </w:rPr>
-              <w:t xml:space="preserve">Amaliyot natijalarini umumlashtirish va korxona rahbariga taqdim etish.</w:t>
-            </w:r>
-          </w:p>
-        </w:tc>
-        <w:tc>
-          <w:tcPr>
-            <w:tcW w:w="4366" w:type="dxa"/>
-            <w:tcBorders>
-              <w:top w:val="single" w:color="000000" w:themeColor="accent6" w:sz="6"/>
-              <w:left w:val="single" w:color="000000" w:themeColor="accent6" w:sz="6"/>
-              <w:bottom w:val="single" w:color="000000" w:themeColor="accent6" w:sz="6"/>
-              <w:right w:val="single" w:color="000000" w:themeColor="accent6" w:sz="6"/>
-            </w:tcBorders>
-            <w:tcMar>
-              <w:top w:w="80" w:type="dxa"/>
-              <w:left w:w="100" w:type="dxa"/>
-              <w:bottom w:w="80" w:type="dxa"/>
-              <w:right w:w="100" w:type="dxa"/>
-            </w:tcMar>
-            <w:vAlign w:val="top"/>
-          </w:tcPr>
-          <w:p>
-            <w:pPr>
-              <w:spacing w:after="200"/>
-            </w:pPr>
-            <w:r>
-              <w:t xml:space="preserve"/>
+              <w:t xml:space="preserve">Video oqimini turli manbalardan qabul qilish, tahlil natijasini planshetlarga uzatish va har bir kadrni hodisalar jurnaliga yozish tartibi o‘rganildi. Model tirikligini tekshirish vositasi ko‘rib chiqildi: u avval qora, oq, shovqinli va haqiqiy tasvirlarga bir xil javob qaytargan modelni aniqlab, uni ishlatishga qo‘ymagan edi. Uzluksiz integratsiya beshta ish oqimidan iborat ekanligi va testlar har bir o‘zgarishda avtomatik ishga tushishi ko‘rib chiqildi.</w:t>
             </w:r>
           </w:p>
           <w:p>
@@ -7605,7 +7927,7 @@
                 <w:sz w:val="22"/>
                 <w:szCs w:val="22"/>
               </w:rPr>
-              <w:t xml:space="preserve">Sana: 06.07.2026</w:t>
+              <w:t xml:space="preserve">Sana: 07.07.2026</w:t>
             </w:r>
           </w:p>
           <w:p>
@@ -7624,9 +7946,68 @@
                 <w:szCs w:val="22"/>
                 <w:lang w:val="en-US"/>
               </w:rPr>
-              <w:t xml:space="preserve">Video oqimini turli manbalardan qabul qilish, tahlil natijasini planshetlarga uzatish va har bir kadrni hodisalar jurnaliga yozish tartibi o‘rganildi. Model tirikligini tekshirish vositasi ko‘rib chiqildi: u avval qora, oq, shovqinli va haqiqiy tasvirlarga bir xil javob qaytargan modelni aniqlab, uni ishlatishga qo‘ymagan edi. Uzluksiz integratsiya beshta ish oqimidan iborat ekanligi va testlar har bir o‘zgarishda avtomatik ishga tushishi ko‘rib chiqildi.</w:t>
-            </w:r>
-          </w:p>
+              <w:t xml:space="preserve">Tizimning asosiy qoidasi o‘rganildi: model hech narsa topmagani hech qachon xavf yo‘q degan xulosa sifatida ko‘rsatilmaydi, chunki bo‘sh natija haqiqatan bo‘sh maydonni ham, modelning ko‘ra olmaganini ham bir xil ifodalaydi. Bu qoida matnlarni tekshiruvchi avtomatik test bilan mustahkamlangani ko‘rib chiqildi. Shu kuni dron ma’lumotlarini tahlil qilish mavzusi Classroom Pack o‘quv dasturiga alohida modul sifatida qo‘shilishi, trenerlarni tayyorlash dasturi va texnik xizmat modeli muhokama qilindi.</w:t>
+            </w:r>
+          </w:p>
+        </w:tc>
+      </w:tr>
+      <w:tr>
+        <w:trPr/>
+        <w:tc>
+          <w:tcPr>
+            <w:tcW w:w="760" w:type="dxa"/>
+            <w:tcBorders>
+              <w:top w:val="single" w:color="000000" w:themeColor="accent6" w:sz="6"/>
+              <w:left w:val="single" w:color="000000" w:themeColor="accent6" w:sz="6"/>
+              <w:bottom w:val="single" w:color="000000" w:themeColor="accent6" w:sz="6"/>
+              <w:right w:val="single" w:color="000000" w:themeColor="accent6" w:sz="6"/>
+            </w:tcBorders>
+            <w:tcMar>
+              <w:top w:w="80" w:type="dxa"/>
+              <w:left w:w="100" w:type="dxa"/>
+              <w:bottom w:w="80" w:type="dxa"/>
+              <w:right w:w="100" w:type="dxa"/>
+            </w:tcMar>
+            <w:textDirection w:val="btLr"/>
+            <w:vAlign w:val="center"/>
+          </w:tcPr>
+          <w:p>
+            <w:pPr>
+              <w:spacing w:before="0" w:after="60" w:line="260" w:lineRule="auto"/>
+              <w:jc w:val="center"/>
+            </w:pPr>
+            <w:r>
+              <w:rPr>
+                <w:rFonts w:ascii="Calibri" w:hAnsi="Calibri" w:eastAsia="Calibri" w:cs="Calibri"/>
+                <w:b w:val="1"/>
+                <w:bCs w:val="1"/>
+                <w:i w:val="1"/>
+                <w:iCs w:val="1"/>
+                <w:sz w:val="20"/>
+                <w:szCs w:val="20"/>
+                <w:lang w:val="en-US"/>
+              </w:rPr>
+              <w:t xml:space="preserve">«06».07.2026 yildan «08».07.2026 yilga qadar.</w:t>
+            </w:r>
+          </w:p>
+        </w:tc>
+        <w:tc>
+          <w:tcPr>
+            <w:tcW w:w="3900" w:type="dxa"/>
+            <w:tcBorders>
+              <w:top w:val="single" w:color="000000" w:themeColor="accent6" w:sz="6"/>
+              <w:left w:val="single" w:color="000000" w:themeColor="accent6" w:sz="6"/>
+              <w:bottom w:val="single" w:color="000000" w:themeColor="accent6" w:sz="6"/>
+              <w:right w:val="single" w:color="000000" w:themeColor="accent6" w:sz="6"/>
+            </w:tcBorders>
+            <w:tcMar>
+              <w:top w:w="80" w:type="dxa"/>
+              <w:left w:w="100" w:type="dxa"/>
+              <w:bottom w:w="80" w:type="dxa"/>
+              <w:right w:w="100" w:type="dxa"/>
+            </w:tcMar>
+            <w:vAlign w:val="top"/>
+          </w:tcPr>
           <w:p>
             <w:pPr>
               <w:spacing w:before="200" w:after="40" w:line="260"/>
@@ -7642,7 +8023,7 @@
                 <w:sz w:val="22"/>
                 <w:szCs w:val="22"/>
               </w:rPr>
-              <w:t xml:space="preserve">Sana: 07.07.2026</w:t>
+              <w:t xml:space="preserve">Sana: 08.07.2026</w:t>
             </w:r>
           </w:p>
           <w:p>
@@ -7661,7 +8042,33 @@
                 <w:szCs w:val="22"/>
                 <w:lang w:val="en-US"/>
               </w:rPr>
-              <w:t xml:space="preserve">Tizimning asosiy qoidasi o‘rganildi: model hech narsa topmagani hech qachon xavf yo‘q degan xulosa sifatida ko‘rsatilmaydi, chunki bo‘sh natija haqiqatan bo‘sh maydonni ham, modelning ko‘ra olmaganini ham bir xil ifodalaydi. Bu qoida matnlarni tekshiruvchi avtomatik test bilan mustahkamlangani ko‘rib chiqildi. Shu kuni dron ma’lumotlarini tahlil qilish mavzusi Classroom Pack o‘quv dasturiga alohida modul sifatida qo‘shilishi, trenerlarni tayyorlash dasturi va texnik xizmat modeli muhokama qilindi.</w:t>
+              <w:t xml:space="preserve">Amaliyot natijalarini umumlashtirish va korxona rahbariga taqdim etish.</w:t>
+            </w:r>
+          </w:p>
+        </w:tc>
+        <w:tc>
+          <w:tcPr>
+            <w:tcW w:w="4366" w:type="dxa"/>
+            <w:tcBorders>
+              <w:top w:val="single" w:color="000000" w:themeColor="accent6" w:sz="6"/>
+              <w:left w:val="single" w:color="000000" w:themeColor="accent6" w:sz="6"/>
+              <w:bottom w:val="single" w:color="000000" w:themeColor="accent6" w:sz="6"/>
+              <w:right w:val="single" w:color="000000" w:themeColor="accent6" w:sz="6"/>
+            </w:tcBorders>
+            <w:tcMar>
+              <w:top w:w="80" w:type="dxa"/>
+              <w:left w:w="100" w:type="dxa"/>
+              <w:bottom w:w="80" w:type="dxa"/>
+              <w:right w:w="100" w:type="dxa"/>
+            </w:tcMar>
+            <w:vAlign w:val="top"/>
+          </w:tcPr>
+          <w:p>
+            <w:pPr>
+              <w:spacing w:after="200"/>
+            </w:pPr>
+            <w:r>
+              <w:t xml:space="preserve"/>
             </w:r>
           </w:p>
           <w:p>
@@ -7807,9 +8214,7 @@
         </w:tc>
       </w:tr>
       <w:tr>
-        <w:trPr>
-          <w:trHeight w:val="11700" w:hRule="atLeast"/>
-        </w:trPr>
+        <w:trPr/>
         <w:tc>
           <w:tcPr>
             <w:tcW w:w="4513" w:type="dxa"/>

</xml_diff>